<commit_message>
documenta actualizaciones en el informe y nota del incidente de Supabase
- Word: seccion de actualizacion del proyecto (Random Forest funcional) y nota final del incidente
- README: estado e incidencia de Supabase y como restaurar el backup
- agrega backup del cluster de Supabase como respaldo
</commit_message>
<xml_diff>
--- a/Informe_Proyecto_Productivo_IIA.docx
+++ b/Informe_Proyecto_Productivo_IIA.docx
@@ -5106,6 +5106,88 @@
         <w:pStyle w:val="Heading1"/>
       </w:pPr>
       <w:r>
+        <w:t>Actualización del proyecto</w:t>
+      </w:r>
+    </w:p>
+    <w:p>
+      <w:r>
+        <w:rPr>
+          <w:b w:val="0"/>
+          <w:i w:val="0"/>
+        </w:rPr>
+        <w:t>Tras la primera entrega incorporé una mejora que faltaba para cerrar el ciclo predictivo: la predicción de precios con Random Forest, que había quedado marcada como "en desarrollo". Ya no es un hueco del tablero, ahora muestra resultados reales y accionables en dos niveles:</w:t>
+      </w:r>
+    </w:p>
+    <w:p>
+      <w:pPr>
+        <w:pStyle w:val="ListBullet"/>
+      </w:pPr>
+      <w:r>
+        <w:t>Por artículo: un modelo Random Forest propio por cada artículo que supera un umbral mínimo de historial (20 registros), entrenado con la cantidad pedida y la ventana temporal (mes y año) como características. Al ser por artículo, no se mezclan precios de productos incomparables, y se reportan el R² y el MAE para que la precisión sea transparente.</w:t>
+      </w:r>
+    </w:p>
+    <w:p>
+      <w:pPr>
+        <w:pStyle w:val="ListBullet"/>
+      </w:pPr>
+      <w:r>
+        <w:t>Tendencia agregada: un segundo modelo sobre la capa gold (gold.prediccion_demanda_mensual) que proyecta el precio promedio del catálogo usando cantidad, frecuencia, stock y la ventana temporal. Da una visión macro de referencia, no un precio puntual de artículo.</w:t>
+      </w:r>
+    </w:p>
+    <w:p>
+      <w:r>
+        <w:rPr>
+          <w:b w:val="0"/>
+          <w:i w:val="0"/>
+        </w:rPr>
+        <w:t>Ambos modelos usan semilla fija (42) para ser reproducibles y reportan sus métricas de error (R² y MAE), porque un pronóstico sin medir su precisión no pasa de ser una corazonada con carácter. También completé el informe con las 16 secciones de este documento y sus referencias.</w:t>
+      </w:r>
+    </w:p>
+    <w:p>
+      <w:pPr>
+        <w:pStyle w:val="Heading1"/>
+      </w:pPr>
+      <w:r>
+        <w:t>Nota final: incidente de Supabase</w:t>
+      </w:r>
+    </w:p>
+    <w:p>
+      <w:r>
+        <w:rPr>
+          <w:b w:val="0"/>
+          <w:i w:val="0"/>
+        </w:rPr>
+        <w:t>Una aclaración honesta antes de cerrar: durante la entrega, la base de datos del proyecto en Supabase sufrió una caída parcial del servicio (incidencia activa de "Project Lifecycle Actions" que bloquea restaurar o crear proyectos). Esto impidió restablecer la conexión de la app en el momento de la presentación.</w:t>
+      </w:r>
+    </w:p>
+    <w:p>
+      <w:r>
+        <w:rPr>
+          <w:b w:val="0"/>
+          <w:i w:val="0"/>
+        </w:rPr>
+        <w:t>Lo bueno es que el proyecto no se pierde: queda un backup completo del cluster (db_cluster-23-08-2026@15-44-39.backup.gz) que respalda las cuatro capas (bronze, silver, normalizado y gold) con sus datos. En cuanto Supabase restablezca el servicio, se restaura el backup y la app vuelve a conectarse sin tocar el código, porque este se mantiene intacto y reproducible.</w:t>
+      </w:r>
+    </w:p>
+    <w:p>
+      <w:r>
+        <w:rPr>
+          <w:b w:val="0"/>
+          <w:i/>
+        </w:rPr>
+        <w:t>Mientras tanto, todo el trabajo de ETL, normalización, capa gold, modelos predictivos y el tablero quedan documentados y verificados. La infraestructura falló, pero el proyecto demuestra que funciona. 🙁</w:t>
+      </w:r>
+    </w:p>
+    <w:p>
+      <w:r>
+        <w:br w:type="page"/>
+      </w:r>
+    </w:p>
+    <w:p>
+      <w:pPr>
+        <w:pStyle w:val="Heading1"/>
+      </w:pPr>
+      <w:r>
         <w:t>Referencias bibliográficas</w:t>
       </w:r>
     </w:p>

</xml_diff>